<commit_message>
Convert data tree to SVG
</commit_message>
<xml_diff>
--- a/cs10/web/w02_tree.docx
+++ b/cs10/web/w02_tree.docx
@@ -59,21 +59,7 @@
           <w:rPr>
             <w:rStyle w:val="Hyperlink"/>
           </w:rPr>
-          <w:t>dmaccarthy.github.io/</w:t>
-        </w:r>
-        <w:proofErr w:type="gramStart"/>
-        <w:r>
-          <w:rPr>
-            <w:rStyle w:val="Hyperlink"/>
-          </w:rPr>
-          <w:t>sci/#</w:t>
-        </w:r>
-        <w:proofErr w:type="gramEnd"/>
-        <w:r>
-          <w:rPr>
-            <w:rStyle w:val="Hyperlink"/>
-          </w:rPr>
-          <w:t>cs_new/web1/tree</w:t>
+          <w:t>dmaccarthy.github.io/sci/#cs_new/web1/tree</w:t>
         </w:r>
       </w:hyperlink>
       <w:r>
@@ -187,6 +173,8 @@
     </w:p>
     <w:p>
       <w:pPr>
+        <w:pStyle w:val="Question1"/>
+        <w:keepNext/>
         <w:jc w:val="center"/>
         <w:rPr>
           <w:lang w:val="en-CA"/>
@@ -194,24 +182,33 @@
       </w:pPr>
       <w:r>
         <w:rPr>
-          <w:lang w:val="en-CA"/>
+          <w:noProof/>
+          <w:lang w:val="en-CA"/>
+          <w14:ligatures w14:val="standardContextual"/>
         </w:rPr>
         <w:drawing>
-          <wp:inline distT="0" distB="0" distL="0" distR="0" wp14:anchorId="35ECC088" wp14:editId="56A2FB05">
-            <wp:extent cx="4793093" cy="3780267"/>
+          <wp:inline distT="0" distB="0" distL="0" distR="0" wp14:anchorId="620D13C9" wp14:editId="41F7F6FF">
+            <wp:extent cx="5029200" cy="4024857"/>
             <wp:effectExtent l="0" t="0" r="0" b="0"/>
-            <wp:docPr id="1" name="image1.png" descr="C:\Users\Dave\Downloads\www\cse\web1\nhl.png"/>
-            <wp:cNvGraphicFramePr/>
+            <wp:docPr id="869476212" name="Graphic 1"/>
+            <wp:cNvGraphicFramePr>
+              <a:graphicFrameLocks xmlns:a="http://schemas.openxmlformats.org/drawingml/2006/main" noChangeAspect="1"/>
+            </wp:cNvGraphicFramePr>
             <a:graphic xmlns:a="http://schemas.openxmlformats.org/drawingml/2006/main">
               <a:graphicData uri="http://schemas.openxmlformats.org/drawingml/2006/picture">
                 <pic:pic xmlns:pic="http://schemas.openxmlformats.org/drawingml/2006/picture">
                   <pic:nvPicPr>
-                    <pic:cNvPr id="0" name="image1.png" descr="C:\Users\Dave\Downloads\www\cse\web1\nhl.png"/>
-                    <pic:cNvPicPr preferRelativeResize="0"/>
+                    <pic:cNvPr id="869476212" name="Graphic 869476212"/>
+                    <pic:cNvPicPr/>
                   </pic:nvPicPr>
                   <pic:blipFill>
-                    <a:blip r:embed="rId7"/>
-                    <a:srcRect/>
+                    <a:blip r:embed="rId7">
+                      <a:extLst>
+                        <a:ext uri="{96DAC541-7B7A-43D3-8B79-37D633B846F1}">
+                          <asvg:svgBlip xmlns:asvg="http://schemas.microsoft.com/office/drawing/2016/SVG/main" r:embed="rId8"/>
+                        </a:ext>
+                      </a:extLst>
+                    </a:blip>
                     <a:stretch>
                       <a:fillRect/>
                     </a:stretch>
@@ -219,12 +216,11 @@
                   <pic:spPr>
                     <a:xfrm>
                       <a:off x="0" y="0"/>
-                      <a:ext cx="4793093" cy="3780267"/>
+                      <a:ext cx="5029200" cy="4024857"/>
                     </a:xfrm>
                     <a:prstGeom prst="rect">
                       <a:avLst/>
                     </a:prstGeom>
-                    <a:ln/>
                   </pic:spPr>
                 </pic:pic>
               </a:graphicData>
@@ -1237,7 +1233,7 @@
         </w:rPr>
         <w:tab/>
       </w:r>
-      <w:hyperlink r:id="rId8">
+      <w:hyperlink r:id="rId9">
         <w:r>
           <w:rPr>
             <w:rStyle w:val="Hyperlink"/>
@@ -1263,8 +1259,8 @@
     </w:p>
     <w:p/>
     <w:sectPr>
-      <w:footerReference w:type="default" r:id="rId9"/>
-      <w:footerReference w:type="first" r:id="rId10"/>
+      <w:footerReference w:type="default" r:id="rId10"/>
+      <w:footerReference w:type="first" r:id="rId11"/>
       <w:pgSz w:w="12240" w:h="15840"/>
       <w:pgMar w:top="1440" w:right="1080" w:bottom="1440" w:left="1080" w:header="0" w:footer="720" w:gutter="0"/>
       <w:pgNumType w:start="1"/>
@@ -2021,6 +2017,7 @@
   <w:style w:type="character" w:default="1" w:styleId="DefaultParagraphFont">
     <w:name w:val="Default Paragraph Font"/>
     <w:uiPriority w:val="1"/>
+    <w:semiHidden/>
     <w:unhideWhenUsed/>
   </w:style>
   <w:style w:type="table" w:default="1" w:styleId="TableNormal">

</xml_diff>